<commit_message>
docs: update corrected validation P2 status (p2-complete now tagged)
P2 was tagged `p2-complete` (2026-06-13) and the AAPL fixtures merged (#94)
after this doc's HEAD pin, so two P2 references had gone stale:
- the phase-table row ("⚠️ tag + fixtures pending" → "✅ Complete")
- the §5.3 todo.md re-label recommendation (dropped "fixtures pending")

Surgical edits to document.xml only; rest of the snapshot unchanged.

Co-Authored-By: Claude Opus 4.8 (1M context) <noreply@anthropic.com>
</commit_message>
<xml_diff>
--- a/docs/TradingWorkbench_TODO_Validation_corrected.docx
+++ b/docs/TradingWorkbench_TODO_Validation_corrected.docx
@@ -982,7 +982,7 @@
           </w:tcPr>
           <w:p>
             <w:r>
-              <w:t xml:space="preserve">⚠️ Code complete; p2-complete tag + AAPL fixtures pending (now generatable, see §4)</w:t>
+              <w:t xml:space="preserve">✅ Complete (AAPL fixtures committed via PR #94; p2-complete tagged 2026-06-13)</w:t>
             </w:r>
           </w:p>
         </w:tc>
@@ -2894,7 +2894,7 @@
     </w:p>
     <w:p>
       <w:r>
-        <w:t xml:space="preserve">P2 is headed “🚧 in progress” and P6 likewise; both are code-complete, and P6 is now tagged (p6-session1-complete). Re-label P2 as “✅ code-complete · p2-complete + AAPL fixtures pending” and P6 as “✅ complete · §2-variant chart half remaining.”</w:t>
+        <w:t xml:space="preserve">P2 is headed “🚧 in progress” and P6 likewise; both are code-complete, and P6 is now tagged (p6-session1-complete). Re-label P2 as “✅ complete (p2-complete tagged 2026-06-13; AAPL fixtures committed)” and P6 as “✅ complete · §2-variant chart half remaining.”</w:t>
       </w:r>
     </w:p>
     <w:p>

</xml_diff>